<commit_message>
Presentation: add sprint 1 activities-and-data slide; update script
Co-Authored-By: Claude Opus 5.5 <noreply@anthropic.com>
Claude-Session: https://claude.ai/code/session_01G4Ddwh7uTVc2EA5q2vaUJ2
</commit_message>
<xml_diff>
--- a/datalab-sprint2/Datalab1_Spreektekst_Presentatie.docx
+++ b/datalab-sprint2/Datalab1_Spreektekst_Presentatie.docx
@@ -1243,7 +1243,7 @@
                 <w:sz w:val="20"/>
                 <w:szCs w:val="20"/>
               </w:rPr>
-              <w:t xml:space="preserve">10. Hypothese</w:t>
+              <w:t xml:space="preserve">10. Activiteiten en data</w:t>
             </w:r>
           </w:p>
         </w:tc>
@@ -1295,7 +1295,7 @@
                 <w:sz w:val="20"/>
                 <w:szCs w:val="20"/>
               </w:rPr>
-              <w:t xml:space="preserve">In sprint 1 hadden we deze hypothese: bedrijfsterreinen verbruiken het meest, woonwijken gemiddeld en natuur het minst. Die kunnen we toetsen met de open data van Enexis per postcode.</w:t>
+              <w:t xml:space="preserve">Uit sprint 1: vijf dingen die Enexis doet en welke data daarbij hoort. Twee weten we zeker, twee deels en één is een aanname. De eerste, verbruik per postcode, gebruiken we voor onze hypothese.</w:t>
             </w:r>
           </w:p>
         </w:tc>
@@ -1327,7 +1327,7 @@
                 <w:sz w:val="20"/>
                 <w:szCs w:val="20"/>
               </w:rPr>
-              <w:t xml:space="preserve">11. Energierekening</w:t>
+              <w:t xml:space="preserve">11. Hypothese</w:t>
             </w:r>
           </w:p>
         </w:tc>
@@ -1381,7 +1381,7 @@
                 <w:sz w:val="20"/>
                 <w:szCs w:val="20"/>
               </w:rPr>
-              <w:t xml:space="preserve">De rekening bestaat uit vier delen: levering, netbeheer, belasting en btw. Enexis krijgt alleen het netbeheer-deel.</w:t>
+              <w:t xml:space="preserve">In sprint 1 hadden we deze hypothese: bedrijfsterreinen verbruiken het meest, woonwijken gemiddeld en natuur het minst. Die kunnen we toetsen met de open data van Enexis per postcode.</w:t>
             </w:r>
           </w:p>
         </w:tc>
@@ -1412,7 +1412,7 @@
                 <w:sz w:val="20"/>
                 <w:szCs w:val="20"/>
               </w:rPr>
-              <w:t xml:space="preserve">12. Datavraag 1</w:t>
+              <w:t xml:space="preserve">12. Energierekening</w:t>
             </w:r>
           </w:p>
         </w:tc>
@@ -1438,7 +1438,7 @@
                 <w:sz w:val="20"/>
                 <w:szCs w:val="20"/>
               </w:rPr>
-              <w:t xml:space="preserve">7:30</w:t>
+              <w:t xml:space="preserve">7:20</w:t>
             </w:r>
           </w:p>
         </w:tc>
@@ -1464,7 +1464,7 @@
                 <w:sz w:val="20"/>
                 <w:szCs w:val="20"/>
               </w:rPr>
-              <w:t xml:space="preserve">Onze eerste datavraag: hoe veranderde de energieprijs in 2022? Gas ging van 1,20 naar 2,78 euro per kuub. Stroom ging van 32 naar 66 cent. De oorzaak was vooral de oorlog in Oekraïne en minder Russisch gas.</w:t>
+              <w:t xml:space="preserve">De rekening bestaat uit vier delen: levering, netbeheer, belasting en btw. Enexis krijgt alleen het netbeheer-deel.</w:t>
             </w:r>
           </w:p>
         </w:tc>
@@ -1496,7 +1496,7 @@
                 <w:sz w:val="20"/>
                 <w:szCs w:val="20"/>
               </w:rPr>
-              <w:t xml:space="preserve">13. Datavraag 2</w:t>
+              <w:t xml:space="preserve">13. Datavraag 1</w:t>
             </w:r>
           </w:p>
         </w:tc>
@@ -1523,7 +1523,7 @@
                 <w:sz w:val="20"/>
                 <w:szCs w:val="20"/>
               </w:rPr>
-              <w:t xml:space="preserve">8:50</w:t>
+              <w:t xml:space="preserve">7:45</w:t>
             </w:r>
           </w:p>
         </w:tc>
@@ -1550,7 +1550,7 @@
                 <w:sz w:val="20"/>
                 <w:szCs w:val="20"/>
               </w:rPr>
-              <w:t xml:space="preserve">Onze tweede datavraag: hoe vaak is er te veel stroom? In 2022 was de stroomprijs 85 uur negatief, in 2025 al 581 uur. Tegelijk wachten ruim 15.000 bedrijven op een aansluiting. Het net is dus soms te vol en soms te leeg.</w:t>
+              <w:t xml:space="preserve">Onze eerste datavraag: hoe veranderde de energieprijs in 2022? Gas ging van 1,20 naar 2,78 euro per kuub. Stroom ging van 32 naar 66 cent. De oorzaak was vooral de oorlog in Oekraïne en minder Russisch gas.</w:t>
             </w:r>
           </w:p>
         </w:tc>
@@ -1581,7 +1581,7 @@
                 <w:sz w:val="20"/>
                 <w:szCs w:val="20"/>
               </w:rPr>
-              <w:t xml:space="preserve">14. Oplossingen</w:t>
+              <w:t xml:space="preserve">14. Datavraag 2</w:t>
             </w:r>
           </w:p>
         </w:tc>
@@ -1607,7 +1607,7 @@
                 <w:sz w:val="20"/>
                 <w:szCs w:val="20"/>
               </w:rPr>
-              <w:t xml:space="preserve">10:00</w:t>
+              <w:t xml:space="preserve">9:00</w:t>
             </w:r>
           </w:p>
         </w:tc>
@@ -1633,7 +1633,7 @@
                 <w:sz w:val="20"/>
                 <w:szCs w:val="20"/>
               </w:rPr>
-              <w:t xml:space="preserve">Dit speelt vooral in de provincies van Enexis. Netbeheerders leggen meer kabels, maar dat duurt lang. Daarom gebruiken ze ook slimme oplossingen, zoals batterijen en afspraken met bedrijven.</w:t>
+              <w:t xml:space="preserve">Onze tweede datavraag: hoe vaak is er te veel stroom? In 2022 was de stroomprijs 85 uur negatief, in 2025 al 581 uur. Tegelijk wachten ruim 15.000 bedrijven op een aansluiting. Het net is dus soms te vol en soms te leeg.</w:t>
             </w:r>
           </w:p>
         </w:tc>
@@ -1665,7 +1665,7 @@
                 <w:sz w:val="20"/>
                 <w:szCs w:val="20"/>
               </w:rPr>
-              <w:t xml:space="preserve">15. Duurzaamheid</w:t>
+              <w:t xml:space="preserve">15. Oplossingen</w:t>
             </w:r>
           </w:p>
         </w:tc>
@@ -1692,7 +1692,7 @@
                 <w:sz w:val="20"/>
                 <w:szCs w:val="20"/>
               </w:rPr>
-              <w:t xml:space="preserve">10:45</w:t>
+              <w:t xml:space="preserve">10:05</w:t>
             </w:r>
           </w:p>
         </w:tc>
@@ -1719,7 +1719,7 @@
                 <w:sz w:val="20"/>
                 <w:szCs w:val="20"/>
               </w:rPr>
-              <w:t xml:space="preserve">Nederland wordt groener: de helft van de stroom is al duurzaam. Pure Energie scoort een 10, Eneco een 8,1 en Essent een 4,8. Maar pas 11,2 procent van de woningen is van het gas af. Dat gaat te langzaam.</w:t>
+              <w:t xml:space="preserve">Dit speelt vooral in de provincies van Enexis. Netbeheerders leggen meer kabels, maar dat duurt lang. Daarom gebruiken ze ook slimme oplossingen, zoals batterijen en afspraken met bedrijven.</w:t>
             </w:r>
           </w:p>
         </w:tc>
@@ -1750,7 +1750,7 @@
                 <w:sz w:val="20"/>
                 <w:szCs w:val="20"/>
               </w:rPr>
-              <w:t xml:space="preserve">16. Privacy</w:t>
+              <w:t xml:space="preserve">16. Duurzaamheid</w:t>
             </w:r>
           </w:p>
         </w:tc>
@@ -1776,6 +1776,91 @@
                 <w:sz w:val="20"/>
                 <w:szCs w:val="20"/>
               </w:rPr>
+              <w:t xml:space="preserve">10:45</w:t>
+            </w:r>
+          </w:p>
+        </w:tc>
+        <w:tc>
+          <w:tcPr>
+            <w:tcW w:type="dxa" w:w="6482"/>
+            <w:tcMar>
+              <w:top w:type="dxa" w:w="70"/>
+              <w:left w:type="dxa" w:w="100"/>
+              <w:bottom w:type="dxa" w:w="70"/>
+              <w:right w:type="dxa" w:w="100"/>
+            </w:tcMar>
+            <w:vAlign w:val="top"/>
+          </w:tcPr>
+          <w:p>
+            <w:pPr>
+              <w:spacing w:after="40"/>
+            </w:pPr>
+            <w:r>
+              <w:rPr>
+                <w:b w:val="false"/>
+                <w:bCs w:val="false"/>
+                <w:sz w:val="20"/>
+                <w:szCs w:val="20"/>
+              </w:rPr>
+              <w:t xml:space="preserve">Nederland wordt groener: de helft van de stroom is al duurzaam. Pure Energie scoort een 10, Eneco een 8,1 en Essent een 4,8. Maar pas 11,2 procent van de woningen is van het gas af. Dat gaat te langzaam.</w:t>
+            </w:r>
+          </w:p>
+        </w:tc>
+      </w:tr>
+      <w:tr>
+        <w:trPr>
+          <w:cantSplit/>
+        </w:trPr>
+        <w:tc>
+          <w:tcPr>
+            <w:tcW w:type="dxa" w:w="2250"/>
+            <w:shd w:fill="F7FAFC" w:color="auto" w:val="clear"/>
+            <w:tcMar>
+              <w:top w:type="dxa" w:w="70"/>
+              <w:left w:type="dxa" w:w="100"/>
+              <w:bottom w:type="dxa" w:w="70"/>
+              <w:right w:type="dxa" w:w="100"/>
+            </w:tcMar>
+            <w:vAlign w:val="top"/>
+          </w:tcPr>
+          <w:p>
+            <w:pPr>
+              <w:spacing w:after="40"/>
+            </w:pPr>
+            <w:r>
+              <w:rPr>
+                <w:b/>
+                <w:bCs/>
+                <w:sz w:val="20"/>
+                <w:szCs w:val="20"/>
+              </w:rPr>
+              <w:t xml:space="preserve">17. Privacy</w:t>
+            </w:r>
+          </w:p>
+        </w:tc>
+        <w:tc>
+          <w:tcPr>
+            <w:tcW w:type="dxa" w:w="900"/>
+            <w:shd w:fill="F7FAFC" w:color="auto" w:val="clear"/>
+            <w:tcMar>
+              <w:top w:type="dxa" w:w="70"/>
+              <w:left w:type="dxa" w:w="100"/>
+              <w:bottom w:type="dxa" w:w="70"/>
+              <w:right w:type="dxa" w:w="100"/>
+            </w:tcMar>
+            <w:vAlign w:val="top"/>
+          </w:tcPr>
+          <w:p>
+            <w:pPr>
+              <w:spacing w:after="40"/>
+            </w:pPr>
+            <w:r>
+              <w:rPr>
+                <w:b w:val="false"/>
+                <w:bCs w:val="false"/>
+                <w:sz w:val="20"/>
+                <w:szCs w:val="20"/>
+              </w:rPr>
               <w:t xml:space="preserve">11:30</w:t>
             </w:r>
           </w:p>
@@ -1783,6 +1868,7 @@
         <w:tc>
           <w:tcPr>
             <w:tcW w:type="dxa" w:w="6482"/>
+            <w:shd w:fill="F7FAFC" w:color="auto" w:val="clear"/>
             <w:tcMar>
               <w:top w:type="dxa" w:w="70"/>
               <w:left w:type="dxa" w:w="100"/>
@@ -1968,7 +2054,7 @@
                 <w:sz w:val="20"/>
                 <w:szCs w:val="20"/>
               </w:rPr>
-              <w:t xml:space="preserve">17. Conclusie</w:t>
+              <w:t xml:space="preserve">18. Conclusie</w:t>
             </w:r>
           </w:p>
         </w:tc>
@@ -2052,7 +2138,7 @@
                 <w:sz w:val="20"/>
                 <w:szCs w:val="20"/>
               </w:rPr>
-              <w:t xml:space="preserve">18. Advies</w:t>
+              <w:t xml:space="preserve">19. Advies</w:t>
             </w:r>
           </w:p>
         </w:tc>
@@ -2137,7 +2223,7 @@
                 <w:sz w:val="20"/>
                 <w:szCs w:val="20"/>
               </w:rPr>
-              <w:t xml:space="preserve">19. Gastspreker</w:t>
+              <w:t xml:space="preserve">20. Gastspreker</w:t>
             </w:r>
           </w:p>
         </w:tc>
@@ -2221,7 +2307,7 @@
                 <w:sz w:val="20"/>
                 <w:szCs w:val="20"/>
               </w:rPr>
-              <w:t xml:space="preserve">20. Samenwerking</w:t>
+              <w:t xml:space="preserve">21. Samenwerking</w:t>
             </w:r>
           </w:p>
         </w:tc>
@@ -2306,7 +2392,7 @@
                 <w:sz w:val="20"/>
                 <w:szCs w:val="20"/>
               </w:rPr>
-              <w:t xml:space="preserve">21. Vragen</w:t>
+              <w:t xml:space="preserve">22. Vragen</w:t>
             </w:r>
           </w:p>
         </w:tc>

</xml_diff>